<commit_message>
feat: created secure foundation jubilee cloud project aws
</commit_message>
<xml_diff>
--- a/1-devops-job-level-middle/Project Documentation.docx
+++ b/1-devops-job-level-middle/Project Documentation.docx
@@ -98,20 +98,70 @@
           <w:rFonts w:ascii="Arial" w:hAnsi="Arial" w:cs="Arial"/>
         </w:rPr>
       </w:pPr>
-      <w:r>
-        <w:rPr>
-          <w:rFonts w:ascii="Arial" w:hAnsi="Arial" w:cs="Arial"/>
-        </w:rPr>
-        <w:t>Store terraform state in s3 bucket</w:t>
-      </w:r>
-      <w:r>
-        <w:rPr>
-          <w:rFonts w:ascii="Arial" w:hAnsi="Arial" w:cs="Arial"/>
-        </w:rPr>
-        <w:t xml:space="preserve"> aws</w:t>
-      </w:r>
       <w:bookmarkStart w:id="0" w:name="_GoBack"/>
       <w:bookmarkEnd w:id="0"/>
+    </w:p>
+    <w:p>
+      <w:pPr>
+        <w:rPr>
+          <w:rFonts w:ascii="Arial" w:hAnsi="Arial" w:cs="Arial"/>
+        </w:rPr>
+      </w:pPr>
+      <w:r>
+        <w:rPr>
+          <w:rFonts w:ascii="Arial" w:hAnsi="Arial" w:cs="Arial"/>
+        </w:rPr>
+        <w:t>Store terraform state in s3 bucket</w:t>
+      </w:r>
+      <w:r>
+        <w:rPr>
+          <w:rFonts w:ascii="Arial" w:hAnsi="Arial" w:cs="Arial"/>
+        </w:rPr>
+        <w:t xml:space="preserve"> </w:t>
+      </w:r>
+      <w:proofErr w:type="spellStart"/>
+      <w:r>
+        <w:rPr>
+          <w:rFonts w:ascii="Arial" w:hAnsi="Arial" w:cs="Arial"/>
+        </w:rPr>
+        <w:t>aws</w:t>
+      </w:r>
+      <w:proofErr w:type="spellEnd"/>
+    </w:p>
+    <w:p>
+      <w:pPr>
+        <w:rPr>
+          <w:rFonts w:ascii="Arial" w:hAnsi="Arial" w:cs="Arial"/>
+        </w:rPr>
+      </w:pPr>
+      <w:r>
+        <w:rPr>
+          <w:rFonts w:ascii="Arial" w:hAnsi="Arial" w:cs="Arial"/>
+        </w:rPr>
+        <w:t xml:space="preserve">Root usage vs non-root usage accounts in </w:t>
+      </w:r>
+      <w:proofErr w:type="spellStart"/>
+      <w:r>
+        <w:rPr>
+          <w:rFonts w:ascii="Arial" w:hAnsi="Arial" w:cs="Arial"/>
+        </w:rPr>
+        <w:t>aws</w:t>
+      </w:r>
+      <w:proofErr w:type="spellEnd"/>
+      <w:r>
+        <w:rPr>
+          <w:rFonts w:ascii="Arial" w:hAnsi="Arial" w:cs="Arial"/>
+        </w:rPr>
+        <w:t xml:space="preserve">, azure, </w:t>
+      </w:r>
+      <w:proofErr w:type="spellStart"/>
+      <w:r>
+        <w:rPr>
+          <w:rFonts w:ascii="Arial" w:hAnsi="Arial" w:cs="Arial"/>
+        </w:rPr>
+        <w:t>gcp</w:t>
+      </w:r>
+      <w:proofErr w:type="spellEnd"/>
     </w:p>
     <w:p/>
     <w:p/>

</xml_diff>

<commit_message>
feat: just added evidence of implementation of secure-cloud-foundation project
</commit_message>
<xml_diff>
--- a/1-devops-job-level-middle/Project Documentation.docx
+++ b/1-devops-job-level-middle/Project Documentation.docx
@@ -98,6 +98,147 @@
           <w:rFonts w:ascii="Arial" w:hAnsi="Arial" w:cs="Arial"/>
         </w:rPr>
       </w:pPr>
+    </w:p>
+    <w:p>
+      <w:pPr>
+        <w:rPr>
+          <w:rFonts w:ascii="Arial" w:hAnsi="Arial" w:cs="Arial"/>
+        </w:rPr>
+      </w:pPr>
+      <w:r>
+        <w:rPr>
+          <w:rFonts w:ascii="Arial" w:hAnsi="Arial" w:cs="Arial"/>
+        </w:rPr>
+        <w:t>Store terraform state in s3 bucket</w:t>
+      </w:r>
+      <w:r>
+        <w:rPr>
+          <w:rFonts w:ascii="Arial" w:hAnsi="Arial" w:cs="Arial"/>
+        </w:rPr>
+        <w:t xml:space="preserve"> </w:t>
+      </w:r>
+      <w:proofErr w:type="spellStart"/>
+      <w:r>
+        <w:rPr>
+          <w:rFonts w:ascii="Arial" w:hAnsi="Arial" w:cs="Arial"/>
+        </w:rPr>
+        <w:t>aws</w:t>
+      </w:r>
+      <w:proofErr w:type="spellEnd"/>
+    </w:p>
+    <w:p>
+      <w:pPr>
+        <w:rPr>
+          <w:rFonts w:ascii="Arial" w:hAnsi="Arial" w:cs="Arial"/>
+        </w:rPr>
+      </w:pPr>
+      <w:r>
+        <w:rPr>
+          <w:rFonts w:ascii="Arial" w:hAnsi="Arial" w:cs="Arial"/>
+        </w:rPr>
+        <w:t xml:space="preserve">Root usage vs non-root usage accounts in </w:t>
+      </w:r>
+      <w:proofErr w:type="spellStart"/>
+      <w:r>
+        <w:rPr>
+          <w:rFonts w:ascii="Arial" w:hAnsi="Arial" w:cs="Arial"/>
+        </w:rPr>
+        <w:t>aws</w:t>
+      </w:r>
+      <w:proofErr w:type="spellEnd"/>
+      <w:r>
+        <w:rPr>
+          <w:rFonts w:ascii="Arial" w:hAnsi="Arial" w:cs="Arial"/>
+        </w:rPr>
+        <w:t xml:space="preserve">, azure, </w:t>
+      </w:r>
+      <w:proofErr w:type="spellStart"/>
+      <w:r>
+        <w:rPr>
+          <w:rFonts w:ascii="Arial" w:hAnsi="Arial" w:cs="Arial"/>
+        </w:rPr>
+        <w:t>gcp</w:t>
+      </w:r>
+      <w:proofErr w:type="spellEnd"/>
+    </w:p>
+    <w:p>
+      <w:pPr>
+        <w:rPr>
+          <w:rFonts w:ascii="Arial" w:hAnsi="Arial" w:cs="Arial"/>
+        </w:rPr>
+      </w:pPr>
+    </w:p>
+    <w:p>
+      <w:pPr>
+        <w:rPr>
+          <w:rFonts w:ascii="Arial" w:hAnsi="Arial" w:cs="Arial"/>
+        </w:rPr>
+      </w:pPr>
+    </w:p>
+    <w:p>
+      <w:pPr>
+        <w:rPr>
+          <w:rFonts w:ascii="Arial" w:hAnsi="Arial" w:cs="Arial"/>
+        </w:rPr>
+      </w:pPr>
+      <w:r>
+        <w:rPr>
+          <w:rFonts w:ascii="Arial" w:hAnsi="Arial" w:cs="Arial"/>
+        </w:rPr>
+        <w:t>JavaScript</w:t>
+      </w:r>
+      <w:r>
+        <w:rPr>
+          <w:rFonts w:ascii="Arial" w:hAnsi="Arial" w:cs="Arial"/>
+        </w:rPr>
+        <w:t xml:space="preserve"> *</w:t>
+      </w:r>
+      <w:r>
+        <w:rPr>
+          <w:rFonts w:ascii="Arial" w:hAnsi="Arial" w:cs="Arial"/>
+        </w:rPr>
+        <w:t xml:space="preserve"> / </w:t>
+      </w:r>
+      <w:proofErr w:type="spellStart"/>
+      <w:r>
+        <w:rPr>
+          <w:rFonts w:ascii="Arial" w:hAnsi="Arial" w:cs="Arial"/>
+        </w:rPr>
+        <w:t>TypeScript</w:t>
+      </w:r>
+      <w:proofErr w:type="spellEnd"/>
+    </w:p>
+    <w:p>
+      <w:pPr>
+        <w:rPr>
+          <w:rFonts w:ascii="Arial" w:hAnsi="Arial" w:cs="Arial"/>
+        </w:rPr>
+      </w:pPr>
+      <w:r>
+        <w:rPr>
+          <w:rFonts w:ascii="Arial" w:hAnsi="Arial" w:cs="Arial"/>
+        </w:rPr>
+        <w:t>React</w:t>
+      </w:r>
+    </w:p>
+    <w:p>
+      <w:pPr>
+        <w:rPr>
+          <w:rFonts w:ascii="Arial" w:hAnsi="Arial" w:cs="Arial"/>
+        </w:rPr>
+      </w:pPr>
+      <w:r>
+        <w:rPr>
+          <w:rFonts w:ascii="Arial" w:hAnsi="Arial" w:cs="Arial"/>
+        </w:rPr>
+        <w:t>Next.js</w:t>
+      </w:r>
+      <w:r>
+        <w:rPr>
+          <w:rFonts w:ascii="Arial" w:hAnsi="Arial" w:cs="Arial"/>
+        </w:rPr>
+        <w:t xml:space="preserve"> *</w:t>
+      </w:r>
       <w:bookmarkStart w:id="0" w:name="_GoBack"/>
       <w:bookmarkEnd w:id="0"/>
     </w:p>
@@ -111,57 +252,21 @@
         <w:rPr>
           <w:rFonts w:ascii="Arial" w:hAnsi="Arial" w:cs="Arial"/>
         </w:rPr>
-        <w:t>Store terraform state in s3 bucket</w:t>
-      </w:r>
-      <w:r>
-        <w:rPr>
-          <w:rFonts w:ascii="Arial" w:hAnsi="Arial" w:cs="Arial"/>
-        </w:rPr>
-        <w:t xml:space="preserve"> </w:t>
-      </w:r>
-      <w:proofErr w:type="spellStart"/>
-      <w:r>
-        <w:rPr>
-          <w:rFonts w:ascii="Arial" w:hAnsi="Arial" w:cs="Arial"/>
-        </w:rPr>
-        <w:t>aws</w:t>
-      </w:r>
-      <w:proofErr w:type="spellEnd"/>
-    </w:p>
-    <w:p>
-      <w:pPr>
-        <w:rPr>
-          <w:rFonts w:ascii="Arial" w:hAnsi="Arial" w:cs="Arial"/>
-        </w:rPr>
-      </w:pPr>
-      <w:r>
-        <w:rPr>
-          <w:rFonts w:ascii="Arial" w:hAnsi="Arial" w:cs="Arial"/>
-        </w:rPr>
-        <w:t xml:space="preserve">Root usage vs non-root usage accounts in </w:t>
-      </w:r>
-      <w:proofErr w:type="spellStart"/>
-      <w:r>
-        <w:rPr>
-          <w:rFonts w:ascii="Arial" w:hAnsi="Arial" w:cs="Arial"/>
-        </w:rPr>
-        <w:t>aws</w:t>
-      </w:r>
-      <w:proofErr w:type="spellEnd"/>
-      <w:r>
-        <w:rPr>
-          <w:rFonts w:ascii="Arial" w:hAnsi="Arial" w:cs="Arial"/>
-        </w:rPr>
-        <w:t xml:space="preserve">, azure, </w:t>
-      </w:r>
-      <w:proofErr w:type="spellStart"/>
-      <w:r>
-        <w:rPr>
-          <w:rFonts w:ascii="Arial" w:hAnsi="Arial" w:cs="Arial"/>
-        </w:rPr>
-        <w:t>gcp</w:t>
-      </w:r>
-      <w:proofErr w:type="spellEnd"/>
+        <w:t>Vue.js</w:t>
+      </w:r>
+    </w:p>
+    <w:p>
+      <w:pPr>
+        <w:rPr>
+          <w:rFonts w:ascii="Arial" w:hAnsi="Arial" w:cs="Arial"/>
+        </w:rPr>
+      </w:pPr>
+      <w:r>
+        <w:rPr>
+          <w:rFonts w:ascii="Arial" w:hAnsi="Arial" w:cs="Arial"/>
+        </w:rPr>
+        <w:t>Node.js</w:t>
+      </w:r>
     </w:p>
     <w:p/>
     <w:p/>

</xml_diff>

<commit_message>
feat: added Production AI/ML Engineer
</commit_message>
<xml_diff>
--- a/1-devops-job-level-middle/Project Documentation.docx
+++ b/1-devops-job-level-middle/Project Documentation.docx
@@ -176,99 +176,9 @@
       </w:pPr>
     </w:p>
     <w:p>
-      <w:pPr>
-        <w:rPr>
-          <w:rFonts w:ascii="Arial" w:hAnsi="Arial" w:cs="Arial"/>
-        </w:rPr>
-      </w:pPr>
-      <w:r>
-        <w:rPr>
-          <w:rFonts w:ascii="Arial" w:hAnsi="Arial" w:cs="Arial"/>
-        </w:rPr>
-        <w:t>JavaScript</w:t>
-      </w:r>
-      <w:r>
-        <w:rPr>
-          <w:rFonts w:ascii="Arial" w:hAnsi="Arial" w:cs="Arial"/>
-        </w:rPr>
-        <w:t xml:space="preserve"> *</w:t>
-      </w:r>
-      <w:r>
-        <w:rPr>
-          <w:rFonts w:ascii="Arial" w:hAnsi="Arial" w:cs="Arial"/>
-        </w:rPr>
-        <w:t xml:space="preserve"> / </w:t>
-      </w:r>
-      <w:proofErr w:type="spellStart"/>
-      <w:r>
-        <w:rPr>
-          <w:rFonts w:ascii="Arial" w:hAnsi="Arial" w:cs="Arial"/>
-        </w:rPr>
-        <w:t>TypeScript</w:t>
-      </w:r>
-      <w:proofErr w:type="spellEnd"/>
-    </w:p>
-    <w:p>
-      <w:pPr>
-        <w:rPr>
-          <w:rFonts w:ascii="Arial" w:hAnsi="Arial" w:cs="Arial"/>
-        </w:rPr>
-      </w:pPr>
-      <w:r>
-        <w:rPr>
-          <w:rFonts w:ascii="Arial" w:hAnsi="Arial" w:cs="Arial"/>
-        </w:rPr>
-        <w:t>React</w:t>
-      </w:r>
-    </w:p>
-    <w:p>
-      <w:pPr>
-        <w:rPr>
-          <w:rFonts w:ascii="Arial" w:hAnsi="Arial" w:cs="Arial"/>
-        </w:rPr>
-      </w:pPr>
-      <w:r>
-        <w:rPr>
-          <w:rFonts w:ascii="Arial" w:hAnsi="Arial" w:cs="Arial"/>
-        </w:rPr>
-        <w:t>Next.js</w:t>
-      </w:r>
-      <w:r>
-        <w:rPr>
-          <w:rFonts w:ascii="Arial" w:hAnsi="Arial" w:cs="Arial"/>
-        </w:rPr>
-        <w:t xml:space="preserve"> *</w:t>
-      </w:r>
       <w:bookmarkStart w:id="0" w:name="_GoBack"/>
       <w:bookmarkEnd w:id="0"/>
     </w:p>
-    <w:p>
-      <w:pPr>
-        <w:rPr>
-          <w:rFonts w:ascii="Arial" w:hAnsi="Arial" w:cs="Arial"/>
-        </w:rPr>
-      </w:pPr>
-      <w:r>
-        <w:rPr>
-          <w:rFonts w:ascii="Arial" w:hAnsi="Arial" w:cs="Arial"/>
-        </w:rPr>
-        <w:t>Vue.js</w:t>
-      </w:r>
-    </w:p>
-    <w:p>
-      <w:pPr>
-        <w:rPr>
-          <w:rFonts w:ascii="Arial" w:hAnsi="Arial" w:cs="Arial"/>
-        </w:rPr>
-      </w:pPr>
-      <w:r>
-        <w:rPr>
-          <w:rFonts w:ascii="Arial" w:hAnsi="Arial" w:cs="Arial"/>
-        </w:rPr>
-        <w:t>Node.js</w:t>
-      </w:r>
-    </w:p>
-    <w:p/>
     <w:p/>
     <w:sectPr>
       <w:pgSz w:w="12240" w:h="15840"/>

</xml_diff>

<commit_message>
feat: added additional ai files and azure devops files
</commit_message>
<xml_diff>
--- a/1-devops-job-level-middle/Project Documentation.docx
+++ b/1-devops-job-level-middle/Project Documentation.docx
@@ -167,18 +167,90 @@
           <w:rFonts w:ascii="Arial" w:hAnsi="Arial" w:cs="Arial"/>
         </w:rPr>
       </w:pPr>
-    </w:p>
-    <w:p>
-      <w:pPr>
-        <w:rPr>
-          <w:rFonts w:ascii="Arial" w:hAnsi="Arial" w:cs="Arial"/>
-        </w:rPr>
-      </w:pPr>
-    </w:p>
-    <w:p>
+      <w:proofErr w:type="gramStart"/>
+      <w:r>
+        <w:rPr>
+          <w:rStyle w:val="qwen-markdown-text"/>
+          <w:rFonts w:ascii="Arial" w:hAnsi="Arial" w:cs="Arial"/>
+          <w:color w:val="1D1D1F"/>
+          <w:bdr w:val="single" w:sz="2" w:space="0" w:color="E3E3E3" w:frame="1"/>
+          <w:shd w:val="clear" w:color="auto" w:fill="FFFFFF"/>
+        </w:rPr>
+        <w:t>r</w:t>
+      </w:r>
+      <w:r>
+        <w:rPr>
+          <w:rStyle w:val="qwen-markdown-text"/>
+          <w:rFonts w:ascii="Arial" w:hAnsi="Arial" w:cs="Arial"/>
+          <w:color w:val="1D1D1F"/>
+          <w:bdr w:val="single" w:sz="2" w:space="0" w:color="E3E3E3" w:frame="1"/>
+          <w:shd w:val="clear" w:color="auto" w:fill="FFFFFF"/>
+        </w:rPr>
+        <w:t>eplace</w:t>
+      </w:r>
+      <w:proofErr w:type="gramEnd"/>
+      <w:r>
+        <w:rPr>
+          <w:rStyle w:val="qwen-markdown-text"/>
+          <w:rFonts w:ascii="Arial" w:hAnsi="Arial" w:cs="Arial"/>
+          <w:color w:val="1D1D1F"/>
+          <w:bdr w:val="single" w:sz="2" w:space="0" w:color="E3E3E3" w:frame="1"/>
+          <w:shd w:val="clear" w:color="auto" w:fill="FFFFFF"/>
+        </w:rPr>
+        <w:t xml:space="preserve"> bastions with </w:t>
+      </w:r>
+      <w:r>
+        <w:rPr>
+          <w:rStyle w:val="qwen-markdown-text"/>
+          <w:rFonts w:ascii="Arial" w:hAnsi="Arial" w:cs="Arial"/>
+          <w:b/>
+          <w:bCs/>
+          <w:color w:val="1D1D1F"/>
+          <w:bdr w:val="single" w:sz="2" w:space="0" w:color="E3E3E3" w:frame="1"/>
+          <w:shd w:val="clear" w:color="auto" w:fill="FFFFFF"/>
+        </w:rPr>
+        <w:t>AWS SSM Sess</w:t>
+      </w:r>
       <w:bookmarkStart w:id="0" w:name="_GoBack"/>
       <w:bookmarkEnd w:id="0"/>
-    </w:p>
+      <w:r>
+        <w:rPr>
+          <w:rStyle w:val="qwen-markdown-text"/>
+          <w:rFonts w:ascii="Arial" w:hAnsi="Arial" w:cs="Arial"/>
+          <w:b/>
+          <w:bCs/>
+          <w:color w:val="1D1D1F"/>
+          <w:bdr w:val="single" w:sz="2" w:space="0" w:color="E3E3E3" w:frame="1"/>
+          <w:shd w:val="clear" w:color="auto" w:fill="FFFFFF"/>
+        </w:rPr>
+        <w:t>ion Manager</w:t>
+      </w:r>
+      <w:r>
+        <w:rPr>
+          <w:rStyle w:val="qwen-markdown-text"/>
+          <w:rFonts w:ascii="Arial" w:hAnsi="Arial" w:cs="Arial"/>
+          <w:color w:val="1D1D1F"/>
+          <w:bdr w:val="single" w:sz="2" w:space="0" w:color="E3E3E3" w:frame="1"/>
+          <w:shd w:val="clear" w:color="auto" w:fill="FFFFFF"/>
+        </w:rPr>
+        <w:t xml:space="preserve"> (SSH without any inbound port, keyless, fully logged — audit gold for Jubilee's governance requirements)</w:t>
+      </w:r>
+    </w:p>
+    <w:p>
+      <w:pPr>
+        <w:rPr>
+          <w:rFonts w:ascii="Arial" w:hAnsi="Arial" w:cs="Arial"/>
+        </w:rPr>
+      </w:pPr>
+    </w:p>
+    <w:p>
+      <w:pPr>
+        <w:rPr>
+          <w:rFonts w:ascii="Arial" w:hAnsi="Arial" w:cs="Arial"/>
+        </w:rPr>
+      </w:pPr>
+    </w:p>
+    <w:p/>
     <w:p/>
     <w:sectPr>
       <w:pgSz w:w="12240" w:h="15840"/>
@@ -622,6 +694,11 @@
       <w:contextualSpacing/>
     </w:pPr>
   </w:style>
+  <w:style w:type="character" w:customStyle="1" w:styleId="qwen-markdown-text">
+    <w:name w:val="qwen-markdown-text"/>
+    <w:basedOn w:val="DefaultParagraphFont"/>
+    <w:rsid w:val="00F86896"/>
+  </w:style>
 </w:styles>
 </file>
 

</xml_diff>